<commit_message>
Complete ЭКО corpus with final 2 recovered documents (27/27)
И-12-10-03 «Корректировка Заказа покупателя в 1С» and И-12-12-06
«Оформление заказа Покупателя в 1С» were pasted directly in chat
(file upload unavailable) and converted to clean .docx the same way
as ПР-08-00-14 earlier. The corpus for the ЭКО_2 isolated test is
now complete — no documents remain missing.

Updated README.md, the eco-converted-for-upload.zip archive, and all
three synced versions of the ЭКО_2 test instruction (md/html/docx) to
reflect 27/27 and drop stale "missing documents" notes.

Co-Authored-By: Claude Sonnet 5 <noreply@anthropic.com>
Claude-Session: https://claude.ai/code/session_01DpSN8JwCJ3tg3JVUadr2zE
</commit_message>
<xml_diff>
--- a/docs/accounts/eco/instrukciya-test-eko-2.docx
+++ b/docs/accounts/eco/instrukciya-test-eko-2.docx
@@ -20,11 +20,9 @@
         <w:rPr>
           <w:b/>
         </w:rPr>
-        <w:t>Загружаем полный, а не урезанный корпус</w:t>
+        <w:t>Загружаем полный, а не урезанный корпус — все 27 документов, включая ПР-08-00-14, И-12-10-03, И-12-12-06, полученные 12.09 текстом в чате, пересобранные в .docx. Урезанный набор «только под эти вопросы» дал бы искусственно завышенную точность (меньше конкурирующего контента) и был бы несравним с прошлыми прогонами.</w:t>
       </w:r>
-      <w:r>
-        <w:t xml:space="preserve"> — те же 24 документа, что были в исходном пилоте, просто пересобранные в .docx. Урезанный набор «только под эти вопросы» дал бы искусственно завышенную точность (меньше конкурирующего контента) и был бы несравним с прошлыми прогонами.</w:t>
-      </w:r>
+      <w:r/>
     </w:p>
     <w:p>
       <w:pPr>
@@ -65,7 +63,7 @@
     </w:p>
     <w:p>
       <w:r>
-        <w:t>24 из 27 файлов. Архив eco-converted-for-upload.zip — все 24 документа исходного корпуса «Эко», пересобраны в чистый .docx (подробности — README.md, раздел «converted-for-upload»). Содержание не редактировалось — только формат.</w:t>
+        <w:t>27 из 27 файлов — полный корпус, ничего не хватает. Архив eco-converted-for-upload.zip — все документы исходного корпуса «Эко», включая три, полученные 12.09 текстом в чате, пересобраны в чистый .docx (подробности — README.md, раздел «converted-for-upload»). Содержание не редактировалось — только формат.</w:t>
       </w:r>
     </w:p>
     <w:p>
@@ -73,11 +71,9 @@
         <w:rPr>
           <w:b/>
         </w:rPr>
-        <w:t xml:space="preserve">Не хватает 3 документов: </w:t>
+        <w:t>Все три ранее недостающих документа получены 12.09.2026: ПР-08-00-14 «Производственный процесс», И-12-10-03 «Корректировка Заказа покупателя в 1С» (п. 5.5 подтверждает предсказанный ответ на вопрос 3.2), И-12-12-06 «Оформление заказа Покупателя». Файловая загрузка не удалась (у ПР-08-00-14 из-за встроенных картинок) — все три прислали текстом прямо в чате. Вопросы 2.2 и 3.2 теперь можно проверить на полном комплекте.</w:t>
       </w:r>
-      <w:r>
-        <w:t>И-12-10-03 «Корректировка Заказу покупателя в 1С», И-12-12-06 «Оформление заказа Покупателя», ПР-08-00-14 «Производственный процесс» (не путать с ПР-09-00-14 «Контроль качества»). Судя по цитатам в ре-тесте 12.09, И-12-10-03 уже есть на платформе отдельно — но раз он не был прислан нам, в архиве его нет. Без этих трёх вопросы 2.2 и 3.2 не смогут раскрыться полностью.</w:t>
-      </w:r>
+      <w:r/>
     </w:p>
     <w:p>
       <w:pPr>
@@ -148,15 +144,7 @@
         <w:pStyle w:val="ListNumber"/>
       </w:pPr>
       <w:r>
-        <w:t>Дождаться статуса «готово» у всех 24 файлов.</w:t>
-      </w:r>
-    </w:p>
-    <w:p>
-      <w:pPr>
-        <w:pStyle w:val="ListNumber"/>
-      </w:pPr>
-      <w:r>
-        <w:t>Если получится добыть 3 недостающих документа (§2) — догрузить их тем же способом.</w:t>
+        <w:t>Дождаться статуса «готово» у всех файлов.</w:t>
       </w:r>
     </w:p>
     <w:p>
@@ -361,7 +349,7 @@
     </w:p>
     <w:p>
       <w:r>
-        <w:t>Три точки на каждый из 18 вопросов: пилот 11.09 → ре-тест 12.09 на eco → тест на ЭКО_2 (проходы A/B). Особое внимание на 4 вопроса, оставшихся нерешёнными на 12.09:</w:t>
+        <w:t>Три точки на каждый из 18 вопросов: пилот 11.09 → ре-тест 12.09 на eco → тест на ЭКО_2 (проходы A/B). Особое внимание на 5 вопросов, оставшихся нерешёнными полностью или частично на 12.09:</w:t>
       </w:r>
     </w:p>
     <w:p>
@@ -369,7 +357,7 @@
         <w:pStyle w:val="ListBullet"/>
       </w:pPr>
       <w:r>
-        <w:t>2.2 — корректировка Заказа на производство (нужен Д-08-04-01, которого не хватает).</w:t>
+        <w:t>2.2 — корректировка Заказа на производство (источник Д-08-04-01 уже в корпусе — на 12.09 платформа его просто не цитировала).</w:t>
       </w:r>
     </w:p>
     <w:p>
@@ -378,6 +366,14 @@
       </w:pPr>
       <w:r>
         <w:t>2.3 — высота сброса тары (ответ должен появиться из metodika-38.docx, который в ЭКО_2 есть и читаем).</w:t>
+      </w:r>
+    </w:p>
+    <w:p>
+      <w:pPr>
+        <w:pStyle w:val="ListBullet"/>
+      </w:pPr>
+      <w:r>
+        <w:t>3.2 — корректировка Заказа покупателя в 1С (источник И-12-10-03 теперь тоже в корпусе — п. 5.5 содержит точную формулировку ответа).</w:t>
       </w:r>
     </w:p>
     <w:p>
@@ -406,7 +402,7 @@
     </w:p>
     <w:p>
       <w:r>
-        <w:t>Даже при чистом результате вопросы 2.2 и 3.2 не смогут быть закрыты полностью без 3 недостающих документов (§2).</w:t>
+        <w:t>Корпус теперь полный (27/27) — открытых пробелов по составу документов больше нет, результат по 2.2/3.2 покажет именно поведение платформы.</w:t>
       </w:r>
     </w:p>
     <w:p>

</xml_diff>